<commit_message>
docs(entrega): el acta daba el correo por resuelto con solo publicar el DNS
La verificacion DKIM de SES caduco en julio y Amazon rechazo la salida del
sandbox: publicar los registros no basta. El punto abierto ahora nombra los
dos pasos y a quien le toca cada uno.

Co-Authored-By: Claude Opus 5.5 <noreply@anthropic.com>
</commit_message>
<xml_diff>
--- a/docs/entrega-final/acta-de-entrega.docx
+++ b/docs/entrega-final/acta-de-entrega.docx
@@ -3197,7 +3197,7 @@
                 <w:sz w:val="18"/>
                 <w:szCs w:val="18"/>
               </w:rPr>
-              <w:t xml:space="preserve">Publicar en el DNS del dominio los 3 registros DKIM ya informados. Con eso AWNA activa el envío. Mientras tanto, las respuestas se publican en el portal y la notificación queda registrada en el servidor</w:t>
+              <w:t xml:space="preserve">Dos pasos: (a) publicar en el DNS del dominio los 3 registros DKIM que AWNA entregará actualizados, y (b) que Amazon apruebe el envío de correos de la cuenta, solicitud que AWNA está gestionando. Con ambos, AWNA activa el envío. Mientras tanto, las respuestas institucionales se publican en el portal y la notificación queda registrada en el servidor</w:t>
             </w:r>
           </w:p>
         </w:tc>
@@ -3222,7 +3222,7 @@
                 <w:sz w:val="18"/>
                 <w:szCs w:val="18"/>
               </w:rPr>
-              <w:t xml:space="preserve">Informática GORE (DNS)</w:t>
+              <w:t xml:space="preserve">Informática GORE (DNS) y AWNA (solicitud a Amazon)</w:t>
             </w:r>
           </w:p>
         </w:tc>

</xml_diff>